<commit_message>
fix: remove dev runtime plugin and add 404.html for spa support
</commit_message>
<xml_diff>
--- a/規格文件/Token Dashboard需求規格說明書_V3.2.docx
+++ b/規格文件/Token Dashboard需求規格說明書_V3.2.docx
@@ -10773,9 +10773,6 @@
       <w:pPr>
         <w:pStyle w:val="-1"/>
         <w:spacing w:before="180" w:after="180"/>
-        <w:rPr>
-          <w:rFonts w:hint="eastAsia"/>
-        </w:rPr>
       </w:pPr>
       <w:r>
         <w:rPr>
@@ -10832,12 +10829,16 @@
           <w:rFonts w:hint="eastAsia"/>
         </w:rPr>
       </w:pPr>
-      <w:bookmarkStart w:id="10" w:name="_Toc224635308"/>
       <w:r>
         <w:lastRenderedPageBreak/>
-        <w:t>企</w:t>
-      </w:r>
-      <w:bookmarkEnd w:id="10"/>
+        <w:t>管理端人物誌（</w:t>
+      </w:r>
+      <w:r>
+        <w:t>Management Persona</w:t>
+      </w:r>
+      <w:r>
+        <w:t>）</w:t>
+      </w:r>
     </w:p>
     <w:p>
       <w:pPr>
@@ -10857,6 +10858,33 @@
       <w:r>
         <w:t>：</w:t>
       </w:r>
+      <w:r>
+        <w:t xml:space="preserve">AI / IT </w:t>
+      </w:r>
+      <w:r>
+        <w:t>管理主管</w:t>
+      </w:r>
+      <w:r>
+        <w:rPr>
+          <w:rFonts w:hint="eastAsia"/>
+        </w:rPr>
+        <w:t>（</w:t>
+      </w:r>
+      <w:r>
+        <w:t xml:space="preserve">AI </w:t>
+      </w:r>
+      <w:r>
+        <w:t>平台負責人</w:t>
+      </w:r>
+      <w:r>
+        <w:t xml:space="preserve"> / IT Manager / AI Governance Manager</w:t>
+      </w:r>
+      <w:r>
+        <w:rPr>
+          <w:rFonts w:hint="eastAsia"/>
+        </w:rPr>
+        <w:t>）</w:t>
+      </w:r>
     </w:p>
     <w:p>
       <w:pPr>
@@ -10874,14 +10902,22 @@
     <w:p>
       <w:pPr>
         <w:pStyle w:val="5"/>
-        <w:numPr>
-          <w:ilvl w:val="0"/>
-          <w:numId w:val="100"/>
-        </w:numPr>
-        <w:spacing w:before="180" w:after="180"/>
-      </w:pPr>
-      <w:r>
-        <w:t>成</w:t>
+        <w:spacing w:before="180" w:after="180"/>
+      </w:pPr>
+      <w:r>
+        <w:t>即時掌握企業整體</w:t>
+      </w:r>
+      <w:r>
+        <w:t xml:space="preserve"> Token </w:t>
+      </w:r>
+      <w:r>
+        <w:t>使用量</w:t>
+      </w:r>
+      <w:r>
+        <w:rPr>
+          <w:rFonts w:hint="eastAsia"/>
+        </w:rPr>
+        <w:t>。</w:t>
       </w:r>
     </w:p>
     <w:p>
@@ -10890,7 +10926,91 @@
         <w:spacing w:before="180" w:after="180"/>
       </w:pPr>
       <w:r>
-        <w:t>提</w:t>
+        <w:t>了解各部門與各應用的</w:t>
+      </w:r>
+      <w:r>
+        <w:t xml:space="preserve"> AI </w:t>
+      </w:r>
+      <w:r>
+        <w:t>使用情況</w:t>
+      </w:r>
+      <w:r>
+        <w:rPr>
+          <w:rFonts w:hint="eastAsia"/>
+        </w:rPr>
+        <w:t>。</w:t>
+      </w:r>
+    </w:p>
+    <w:p>
+      <w:pPr>
+        <w:pStyle w:val="5"/>
+        <w:spacing w:before="180" w:after="180"/>
+      </w:pPr>
+      <w:r>
+        <w:t>控制</w:t>
+      </w:r>
+      <w:r>
+        <w:t xml:space="preserve"> AI API </w:t>
+      </w:r>
+      <w:r>
+        <w:t>成本並避免預算失控</w:t>
+      </w:r>
+      <w:r>
+        <w:rPr>
+          <w:rFonts w:hint="eastAsia"/>
+        </w:rPr>
+        <w:t>。</w:t>
+      </w:r>
+    </w:p>
+    <w:p>
+      <w:pPr>
+        <w:pStyle w:val="5"/>
+        <w:spacing w:before="180" w:after="180"/>
+      </w:pPr>
+      <w:r>
+        <w:t>建立</w:t>
+      </w:r>
+      <w:r>
+        <w:t xml:space="preserve"> AI </w:t>
+      </w:r>
+      <w:r>
+        <w:t>使用治理（</w:t>
+      </w:r>
+      <w:r>
+        <w:t>AI Governance</w:t>
+      </w:r>
+      <w:r>
+        <w:t>）與管理制度</w:t>
+      </w:r>
+      <w:r>
+        <w:rPr>
+          <w:rFonts w:hint="eastAsia"/>
+        </w:rPr>
+        <w:t>。</w:t>
+      </w:r>
+    </w:p>
+    <w:p>
+      <w:pPr>
+        <w:pStyle w:val="5"/>
+        <w:spacing w:before="180" w:after="180"/>
+        <w:rPr>
+          <w:rFonts w:hint="eastAsia"/>
+        </w:rPr>
+      </w:pPr>
+      <w:r>
+        <w:t>找出</w:t>
+      </w:r>
+      <w:r>
+        <w:t xml:space="preserve"> Token </w:t>
+      </w:r>
+      <w:r>
+        <w:t>使用效率不佳的應用或部門</w:t>
+      </w:r>
+      <w:r>
+        <w:rPr>
+          <w:rFonts w:hint="eastAsia"/>
+        </w:rPr>
+        <w:t>。</w:t>
       </w:r>
     </w:p>
     <w:p>
@@ -10907,12 +11027,21 @@
         <w:pStyle w:val="5"/>
         <w:numPr>
           <w:ilvl w:val="0"/>
-          <w:numId w:val="101"/>
+          <w:numId w:val="302"/>
         </w:numPr>
         <w:spacing w:before="180" w:after="180"/>
       </w:pPr>
       <w:r>
-        <w:t>資</w:t>
+        <w:t xml:space="preserve">AI Token </w:t>
+      </w:r>
+      <w:r>
+        <w:t>使用分散在不同系統中，缺乏集中管理平台</w:t>
+      </w:r>
+      <w:r>
+        <w:rPr>
+          <w:rFonts w:hint="eastAsia"/>
+        </w:rPr>
+        <w:t>。</w:t>
       </w:r>
     </w:p>
     <w:p>
@@ -10920,6 +11049,72 @@
         <w:pStyle w:val="5"/>
         <w:spacing w:before="180" w:after="180"/>
       </w:pPr>
+      <w:r>
+        <w:t>無法快速知道</w:t>
+      </w:r>
+      <w:r>
+        <w:t xml:space="preserve"> </w:t>
+      </w:r>
+      <w:r>
+        <w:t>哪個部門或應用消耗最多資源</w:t>
+      </w:r>
+      <w:r>
+        <w:rPr>
+          <w:rFonts w:hint="eastAsia"/>
+        </w:rPr>
+        <w:t>。</w:t>
+      </w:r>
+    </w:p>
+    <w:p>
+      <w:pPr>
+        <w:pStyle w:val="5"/>
+        <w:spacing w:before="180" w:after="180"/>
+      </w:pPr>
+      <w:r>
+        <w:t>每月帳單只有總費用，缺乏詳細分析</w:t>
+      </w:r>
+      <w:r>
+        <w:rPr>
+          <w:rFonts w:hint="eastAsia"/>
+        </w:rPr>
+        <w:t>。</w:t>
+      </w:r>
+    </w:p>
+    <w:p>
+      <w:pPr>
+        <w:pStyle w:val="5"/>
+        <w:spacing w:before="180" w:after="180"/>
+      </w:pPr>
+      <w:r>
+        <w:t>無法設定</w:t>
+      </w:r>
+      <w:r>
+        <w:t xml:space="preserve"> Token </w:t>
+      </w:r>
+      <w:r>
+        <w:t>使用預算或警示機制</w:t>
+      </w:r>
+      <w:r>
+        <w:rPr>
+          <w:rFonts w:hint="eastAsia"/>
+        </w:rPr>
+        <w:t>。</w:t>
+      </w:r>
+    </w:p>
+    <w:p>
+      <w:pPr>
+        <w:pStyle w:val="5"/>
+        <w:spacing w:before="180" w:after="180"/>
+      </w:pPr>
+      <w:r>
+        <w:t>需要人工整理報表，耗費大量管理時間</w:t>
+      </w:r>
+      <w:r>
+        <w:rPr>
+          <w:rFonts w:hint="eastAsia"/>
+        </w:rPr>
+        <w:t>。</w:t>
+      </w:r>
     </w:p>
     <w:p>
       <w:pPr>
@@ -10935,12 +11130,30 @@
         <w:pStyle w:val="5"/>
         <w:numPr>
           <w:ilvl w:val="0"/>
-          <w:numId w:val="102"/>
+          <w:numId w:val="303"/>
         </w:numPr>
         <w:spacing w:before="180" w:after="180"/>
       </w:pPr>
       <w:r>
-        <w:t>希</w:t>
+        <w:t>建立</w:t>
+      </w:r>
+      <w:r>
+        <w:t xml:space="preserve"> </w:t>
+      </w:r>
+      <w:r>
+        <w:t>企業</w:t>
+      </w:r>
+      <w:r>
+        <w:t xml:space="preserve"> AI </w:t>
+      </w:r>
+      <w:r>
+        <w:t>使用監控與治理機制</w:t>
+      </w:r>
+      <w:r>
+        <w:rPr>
+          <w:rFonts w:hint="eastAsia"/>
+        </w:rPr>
+        <w:t>。</w:t>
       </w:r>
     </w:p>
     <w:p>
@@ -10948,6 +11161,78 @@
         <w:pStyle w:val="5"/>
         <w:spacing w:before="180" w:after="180"/>
       </w:pPr>
+      <w:r>
+        <w:t>提升</w:t>
+      </w:r>
+      <w:r>
+        <w:t xml:space="preserve"> IT </w:t>
+      </w:r>
+      <w:r>
+        <w:t>資源管理效率</w:t>
+      </w:r>
+      <w:r>
+        <w:rPr>
+          <w:rFonts w:hint="eastAsia"/>
+        </w:rPr>
+        <w:t>。</w:t>
+      </w:r>
+    </w:p>
+    <w:p>
+      <w:pPr>
+        <w:pStyle w:val="5"/>
+        <w:spacing w:before="180" w:after="180"/>
+      </w:pPr>
+      <w:r>
+        <w:t>讓</w:t>
+      </w:r>
+      <w:r>
+        <w:t xml:space="preserve"> AI </w:t>
+      </w:r>
+      <w:r>
+        <w:t>成本從</w:t>
+      </w:r>
+      <w:r>
+        <w:t xml:space="preserve"> </w:t>
+      </w:r>
+      <w:r>
+        <w:t>不可控支出變為可管理成本</w:t>
+      </w:r>
+      <w:r>
+        <w:rPr>
+          <w:rFonts w:hint="eastAsia"/>
+        </w:rPr>
+        <w:t>。</w:t>
+      </w:r>
+    </w:p>
+    <w:p>
+      <w:pPr>
+        <w:pStyle w:val="5"/>
+        <w:spacing w:before="180" w:after="180"/>
+        <w:rPr>
+          <w:rFonts w:hint="eastAsia"/>
+        </w:rPr>
+      </w:pPr>
+      <w:r>
+        <w:t>透過數據分析</w:t>
+      </w:r>
+      <w:r>
+        <w:t xml:space="preserve"> </w:t>
+      </w:r>
+      <w:r>
+        <w:t>優化</w:t>
+      </w:r>
+      <w:r>
+        <w:t xml:space="preserve"> AI </w:t>
+      </w:r>
+      <w:r>
+        <w:t>使用策略</w:t>
+      </w:r>
+      <w:r>
+        <w:rPr>
+          <w:rFonts w:hint="eastAsia"/>
+        </w:rPr>
+        <w:t>。</w:t>
+      </w:r>
     </w:p>
     <w:p>
       <w:pPr>
@@ -10967,6 +11252,42 @@
       <w:r>
         <w:t>：</w:t>
       </w:r>
+      <w:r>
+        <w:t>部門主管</w:t>
+      </w:r>
+      <w:r>
+        <w:t xml:space="preserve"> / </w:t>
+      </w:r>
+      <w:r>
+        <w:t>營運主管</w:t>
+      </w:r>
+      <w:r>
+        <w:rPr>
+          <w:rFonts w:hint="eastAsia"/>
+        </w:rPr>
+        <w:t>（</w:t>
+      </w:r>
+      <w:r>
+        <w:t>營運主管</w:t>
+      </w:r>
+      <w:r>
+        <w:t xml:space="preserve"> / </w:t>
+      </w:r>
+      <w:r>
+        <w:t>產品主管</w:t>
+      </w:r>
+      <w:r>
+        <w:t xml:space="preserve"> / </w:t>
+      </w:r>
+      <w:r>
+        <w:t>行銷主管</w:t>
+      </w:r>
+      <w:r>
+        <w:rPr>
+          <w:rFonts w:hint="eastAsia"/>
+        </w:rPr>
+        <w:t>）</w:t>
+      </w:r>
     </w:p>
     <w:p>
       <w:pPr>
@@ -10986,12 +11307,25 @@
         <w:pStyle w:val="5"/>
         <w:numPr>
           <w:ilvl w:val="0"/>
-          <w:numId w:val="103"/>
+          <w:numId w:val="304"/>
         </w:numPr>
         <w:spacing w:before="180" w:after="180"/>
       </w:pPr>
       <w:r>
-        <w:t>整</w:t>
+        <w:lastRenderedPageBreak/>
+        <w:t>了解團隊使用</w:t>
+      </w:r>
+      <w:r>
+        <w:t xml:space="preserve"> AI </w:t>
+      </w:r>
+      <w:r>
+        <w:t>的情況與效率</w:t>
+      </w:r>
+      <w:r>
+        <w:rPr>
+          <w:rFonts w:hint="eastAsia"/>
+        </w:rPr>
+        <w:t>。</w:t>
       </w:r>
     </w:p>
     <w:p>
@@ -10999,6 +11333,66 @@
         <w:pStyle w:val="5"/>
         <w:spacing w:before="180" w:after="180"/>
       </w:pPr>
+      <w:r>
+        <w:t>掌握部門</w:t>
+      </w:r>
+      <w:r>
+        <w:t xml:space="preserve"> AI </w:t>
+      </w:r>
+      <w:r>
+        <w:t>成本與預算</w:t>
+      </w:r>
+      <w:r>
+        <w:rPr>
+          <w:rFonts w:hint="eastAsia"/>
+        </w:rPr>
+        <w:t>。</w:t>
+      </w:r>
+    </w:p>
+    <w:p>
+      <w:pPr>
+        <w:pStyle w:val="5"/>
+        <w:spacing w:before="180" w:after="180"/>
+      </w:pPr>
+      <w:r>
+        <w:t>找出最有價值的</w:t>
+      </w:r>
+      <w:r>
+        <w:t xml:space="preserve"> AI </w:t>
+      </w:r>
+      <w:r>
+        <w:t>使用方式</w:t>
+      </w:r>
+      <w:r>
+        <w:rPr>
+          <w:rFonts w:hint="eastAsia"/>
+        </w:rPr>
+        <w:t>。</w:t>
+      </w:r>
+    </w:p>
+    <w:p>
+      <w:pPr>
+        <w:pStyle w:val="5"/>
+        <w:spacing w:before="180" w:after="180"/>
+        <w:rPr>
+          <w:rFonts w:hint="eastAsia"/>
+        </w:rPr>
+      </w:pPr>
+      <w:r>
+        <w:t>確保團隊在合理成本下最大化</w:t>
+      </w:r>
+      <w:r>
+        <w:t xml:space="preserve"> AI </w:t>
+      </w:r>
+      <w:r>
+        <w:t>效率</w:t>
+      </w:r>
+      <w:r>
+        <w:rPr>
+          <w:rFonts w:hint="eastAsia"/>
+        </w:rPr>
+        <w:t>。</w:t>
+      </w:r>
     </w:p>
     <w:p>
       <w:pPr>
@@ -11061,11 +11455,15 @@
         <w:pStyle w:val="2"/>
         <w:spacing w:before="180" w:after="180"/>
       </w:pPr>
-      <w:bookmarkStart w:id="11" w:name="_Toc224635309"/>
-      <w:r>
-        <w:t>員</w:t>
-      </w:r>
-      <w:bookmarkEnd w:id="11"/>
+      <w:r>
+        <w:t>員工端人物誌（</w:t>
+      </w:r>
+      <w:r>
+        <w:t>Employee Persona</w:t>
+      </w:r>
+      <w:r>
+        <w:t>）</w:t>
+      </w:r>
     </w:p>
     <w:p>
       <w:pPr>
@@ -11077,7 +11475,6 @@
         <w:spacing w:before="180" w:after="180"/>
       </w:pPr>
       <w:r>
-        <w:lastRenderedPageBreak/>
         <w:t>Persona C1</w:t>
       </w:r>
       <w:r>
@@ -11198,6 +11595,7 @@
         <w:spacing w:before="180" w:after="180"/>
       </w:pPr>
       <w:r>
+        <w:lastRenderedPageBreak/>
         <w:t>主要目標：</w:t>
       </w:r>
     </w:p>
@@ -11294,9 +11692,8 @@
       <w:pPr>
         <w:pStyle w:val="10"/>
       </w:pPr>
-      <w:bookmarkStart w:id="12" w:name="_Toc224635310"/>
-      <w:r>
-        <w:lastRenderedPageBreak/>
+      <w:bookmarkStart w:id="10" w:name="_Toc224635310"/>
+      <w:r>
         <w:t>使用情境與流程（</w:t>
       </w:r>
       <w:r>
@@ -11305,7 +11702,7 @@
       <w:r>
         <w:t>）</w:t>
       </w:r>
-      <w:bookmarkEnd w:id="12"/>
+      <w:bookmarkEnd w:id="10"/>
     </w:p>
     <w:p>
       <w:pPr>
@@ -11316,11 +11713,15 @@
         </w:numPr>
         <w:spacing w:before="180" w:after="180"/>
       </w:pPr>
-      <w:bookmarkStart w:id="13" w:name="_Toc224635311"/>
-      <w:r>
-        <w:t>企業端人物誌（企業內部導入者／治理者／維運管理者）</w:t>
-      </w:r>
-      <w:bookmarkEnd w:id="13"/>
+      <w:r>
+        <w:t>管理端人物誌（</w:t>
+      </w:r>
+      <w:r>
+        <w:t>Management Persona</w:t>
+      </w:r>
+      <w:r>
+        <w:t>）</w:t>
+      </w:r>
     </w:p>
     <w:p>
       <w:pPr>
@@ -11475,6 +11876,7 @@
         <w:spacing w:before="180" w:after="180"/>
       </w:pPr>
       <w:r>
+        <w:lastRenderedPageBreak/>
         <w:t>登</w:t>
       </w:r>
     </w:p>
@@ -11486,95 +11888,18 @@
     </w:p>
     <w:p>
       <w:pPr>
-        <w:pStyle w:val="3"/>
-        <w:numPr>
-          <w:ilvl w:val="0"/>
-          <w:numId w:val="14"/>
-        </w:numPr>
-        <w:spacing w:before="180" w:after="180"/>
-      </w:pPr>
-      <w:r>
-        <w:t>Persona B</w:t>
-      </w:r>
-      <w:r>
-        <w:t>3</w:t>
-      </w:r>
-      <w:r>
-        <w:t>：</w:t>
-      </w:r>
-    </w:p>
-    <w:p>
-      <w:pPr>
-        <w:pStyle w:val="4"/>
-        <w:numPr>
-          <w:ilvl w:val="0"/>
-          <w:numId w:val="15"/>
-        </w:numPr>
-        <w:spacing w:before="180" w:after="180"/>
-      </w:pPr>
-      <w:r>
-        <w:t>使用情境（</w:t>
-      </w:r>
-      <w:r>
-        <w:t>User Scenario</w:t>
-      </w:r>
-      <w:r>
-        <w:t>）：</w:t>
-      </w:r>
-    </w:p>
-    <w:p>
-      <w:pPr>
-        <w:pStyle w:val="-4"/>
-        <w:spacing w:before="180" w:after="180"/>
-      </w:pPr>
-      <w:r>
-        <w:t>部</w:t>
-      </w:r>
-    </w:p>
-    <w:p>
-      <w:pPr>
-        <w:pStyle w:val="4"/>
-        <w:spacing w:before="180" w:after="180"/>
-      </w:pPr>
-      <w:r>
-        <w:t>使用流程（</w:t>
-      </w:r>
-      <w:r>
-        <w:t>User Flow</w:t>
-      </w:r>
-      <w:r>
-        <w:t>）：</w:t>
-      </w:r>
-    </w:p>
-    <w:p>
-      <w:pPr>
-        <w:pStyle w:val="5"/>
-        <w:numPr>
-          <w:ilvl w:val="0"/>
-          <w:numId w:val="122"/>
-        </w:numPr>
-        <w:spacing w:before="180" w:after="180"/>
-      </w:pPr>
-      <w:r>
-        <w:t>登</w:t>
-      </w:r>
-    </w:p>
-    <w:p>
-      <w:pPr>
-        <w:pStyle w:val="5"/>
-        <w:spacing w:before="180" w:after="180"/>
-      </w:pPr>
-    </w:p>
-    <w:p>
-      <w:pPr>
         <w:pStyle w:val="2"/>
         <w:spacing w:before="180" w:after="180"/>
       </w:pPr>
-      <w:bookmarkStart w:id="14" w:name="_Toc224635312"/>
-      <w:r>
-        <w:t>員工端人物誌（企業內部使用者／知識需求者／流程執行）</w:t>
-      </w:r>
-      <w:bookmarkEnd w:id="14"/>
+      <w:r>
+        <w:t>員工端人物誌（</w:t>
+      </w:r>
+      <w:r>
+        <w:t>Employee Persona</w:t>
+      </w:r>
+      <w:r>
+        <w:t>）</w:t>
+      </w:r>
     </w:p>
     <w:p>
       <w:pPr>
@@ -11605,7 +11930,6 @@
         <w:spacing w:before="180" w:after="180"/>
       </w:pPr>
       <w:r>
-        <w:lastRenderedPageBreak/>
         <w:t>使用情境（</w:t>
       </w:r>
       <w:r>
@@ -11738,87 +12062,6 @@
     </w:p>
     <w:p>
       <w:pPr>
-        <w:pStyle w:val="3"/>
-        <w:numPr>
-          <w:ilvl w:val="0"/>
-          <w:numId w:val="16"/>
-        </w:numPr>
-        <w:spacing w:before="180" w:after="180"/>
-      </w:pPr>
-      <w:r>
-        <w:t>Persona C</w:t>
-      </w:r>
-      <w:r>
-        <w:t>3</w:t>
-      </w:r>
-      <w:r>
-        <w:t>：</w:t>
-      </w:r>
-    </w:p>
-    <w:p>
-      <w:pPr>
-        <w:pStyle w:val="4"/>
-        <w:numPr>
-          <w:ilvl w:val="0"/>
-          <w:numId w:val="127"/>
-        </w:numPr>
-        <w:spacing w:before="180" w:after="180"/>
-      </w:pPr>
-      <w:r>
-        <w:t>使用情境（</w:t>
-      </w:r>
-      <w:r>
-        <w:t>User Scenario</w:t>
-      </w:r>
-      <w:r>
-        <w:t>）：</w:t>
-      </w:r>
-    </w:p>
-    <w:p>
-      <w:pPr>
-        <w:pStyle w:val="-4"/>
-        <w:spacing w:before="180" w:after="180"/>
-      </w:pPr>
-      <w:r>
-        <w:t>新</w:t>
-      </w:r>
-    </w:p>
-    <w:p>
-      <w:pPr>
-        <w:pStyle w:val="4"/>
-        <w:spacing w:before="180" w:after="180"/>
-      </w:pPr>
-      <w:r>
-        <w:t>使用流程（</w:t>
-      </w:r>
-      <w:r>
-        <w:t>User Flow</w:t>
-      </w:r>
-      <w:r>
-        <w:t>）：</w:t>
-      </w:r>
-    </w:p>
-    <w:p>
-      <w:pPr>
-        <w:pStyle w:val="5"/>
-        <w:numPr>
-          <w:ilvl w:val="0"/>
-          <w:numId w:val="128"/>
-        </w:numPr>
-        <w:spacing w:before="180" w:after="180"/>
-      </w:pPr>
-      <w:r>
-        <w:t>入</w:t>
-      </w:r>
-    </w:p>
-    <w:p>
-      <w:pPr>
-        <w:pStyle w:val="5"/>
-        <w:spacing w:before="180" w:after="180"/>
-      </w:pPr>
-    </w:p>
-    <w:p>
-      <w:pPr>
         <w:pStyle w:val="2"/>
         <w:numPr>
           <w:ilvl w:val="0"/>
@@ -11839,7 +12082,7 @@
           <w:numId w:val="7"/>
         </w:numPr>
       </w:pPr>
-      <w:bookmarkStart w:id="15" w:name="_Toc224635313"/>
+      <w:bookmarkStart w:id="11" w:name="_Toc224635313"/>
       <w:r>
         <w:lastRenderedPageBreak/>
         <w:t>UI</w:t>
@@ -11847,7 +12090,7 @@
       <w:r>
         <w:t>畫面區塊定義</w:t>
       </w:r>
-      <w:bookmarkEnd w:id="15"/>
+      <w:bookmarkEnd w:id="11"/>
     </w:p>
     <w:p>
       <w:pPr>
@@ -12728,7 +12971,7 @@
           <w:numId w:val="7"/>
         </w:numPr>
       </w:pPr>
-      <w:bookmarkStart w:id="16" w:name="_Toc224635314"/>
+      <w:bookmarkStart w:id="12" w:name="_Toc224635314"/>
       <w:proofErr w:type="spellStart"/>
       <w:r>
         <w:t>Qbi</w:t>
@@ -12737,7 +12980,7 @@
       <w:r>
         <w:t>助理功能需求模組</w:t>
       </w:r>
-      <w:bookmarkEnd w:id="16"/>
+      <w:bookmarkEnd w:id="12"/>
     </w:p>
     <w:p>
       <w:pPr>
@@ -12748,14 +12991,14 @@
         </w:numPr>
         <w:spacing w:before="180" w:after="180"/>
       </w:pPr>
-      <w:bookmarkStart w:id="17" w:name="_Toc224635315"/>
+      <w:bookmarkStart w:id="13" w:name="_Toc224635315"/>
       <w:r>
         <w:t>Navbar</w:t>
       </w:r>
       <w:r>
         <w:t>模組</w:t>
       </w:r>
-      <w:bookmarkEnd w:id="17"/>
+      <w:bookmarkEnd w:id="13"/>
     </w:p>
     <w:p>
       <w:pPr>
@@ -13857,11 +14100,11 @@
         </w:numPr>
         <w:spacing w:before="180" w:after="180"/>
       </w:pPr>
-      <w:bookmarkStart w:id="18" w:name="_Toc224635316"/>
+      <w:bookmarkStart w:id="14" w:name="_Toc224635316"/>
       <w:r>
         <w:t>互動區模組</w:t>
       </w:r>
-      <w:bookmarkEnd w:id="18"/>
+      <w:bookmarkEnd w:id="14"/>
     </w:p>
     <w:p>
       <w:pPr>
@@ -16082,7 +16325,7 @@
         </w:numPr>
         <w:spacing w:before="180" w:after="180"/>
       </w:pPr>
-      <w:bookmarkStart w:id="19" w:name="_Toc224635317"/>
+      <w:bookmarkStart w:id="15" w:name="_Toc224635317"/>
       <w:r>
         <w:t>輸入區</w:t>
       </w:r>
@@ -16092,7 +16335,7 @@
       <w:r>
         <w:t>組</w:t>
       </w:r>
-      <w:bookmarkEnd w:id="19"/>
+      <w:bookmarkEnd w:id="15"/>
     </w:p>
     <w:p>
       <w:pPr>
@@ -19363,11 +19606,11 @@
         </w:numPr>
         <w:spacing w:before="180" w:after="180"/>
       </w:pPr>
-      <w:bookmarkStart w:id="20" w:name="_Toc224635318"/>
+      <w:bookmarkStart w:id="16" w:name="_Toc224635318"/>
       <w:r>
         <w:t>側邊欄模組</w:t>
       </w:r>
-      <w:bookmarkEnd w:id="20"/>
+      <w:bookmarkEnd w:id="16"/>
     </w:p>
     <w:p>
       <w:pPr>
@@ -24694,11 +24937,11 @@
         <w:pStyle w:val="2"/>
         <w:spacing w:before="180" w:after="180"/>
       </w:pPr>
-      <w:bookmarkStart w:id="21" w:name="_Toc224635319"/>
+      <w:bookmarkStart w:id="17" w:name="_Toc224635319"/>
       <w:r>
         <w:t>系統管理模組</w:t>
       </w:r>
-      <w:bookmarkEnd w:id="21"/>
+      <w:bookmarkEnd w:id="17"/>
     </w:p>
     <w:p>
       <w:pPr>
@@ -25428,7 +25671,7 @@
           <w:numId w:val="7"/>
         </w:numPr>
       </w:pPr>
-      <w:bookmarkStart w:id="22" w:name="_Toc224635320"/>
+      <w:bookmarkStart w:id="18" w:name="_Toc224635320"/>
       <w:r>
         <w:t>系統非功能性需求與品質約束（</w:t>
       </w:r>
@@ -25438,7 +25681,7 @@
       <w:r>
         <w:t>）</w:t>
       </w:r>
-      <w:bookmarkEnd w:id="22"/>
+      <w:bookmarkEnd w:id="18"/>
     </w:p>
     <w:p>
       <w:pPr>
@@ -25535,7 +25778,7 @@
         </w:numPr>
         <w:spacing w:before="180" w:after="180"/>
       </w:pPr>
-      <w:bookmarkStart w:id="23" w:name="_Toc224635321"/>
+      <w:bookmarkStart w:id="19" w:name="_Toc224635321"/>
       <w:r>
         <w:t>效能與回應時間需求（</w:t>
       </w:r>
@@ -25545,7 +25788,7 @@
       <w:r>
         <w:t>）</w:t>
       </w:r>
-      <w:bookmarkEnd w:id="23"/>
+      <w:bookmarkEnd w:id="19"/>
     </w:p>
     <w:p>
       <w:pPr>
@@ -25870,7 +26113,7 @@
         <w:pStyle w:val="2"/>
         <w:spacing w:before="180" w:after="180"/>
       </w:pPr>
-      <w:bookmarkStart w:id="24" w:name="_Toc224635322"/>
+      <w:bookmarkStart w:id="20" w:name="_Toc224635322"/>
       <w:r>
         <w:t>穩定性與可用性（</w:t>
       </w:r>
@@ -25880,7 +26123,7 @@
       <w:r>
         <w:t>）</w:t>
       </w:r>
-      <w:bookmarkEnd w:id="24"/>
+      <w:bookmarkEnd w:id="20"/>
     </w:p>
     <w:p>
       <w:pPr>
@@ -26034,7 +26277,7 @@
         <w:pStyle w:val="2"/>
         <w:spacing w:before="180" w:after="180"/>
       </w:pPr>
-      <w:bookmarkStart w:id="25" w:name="_Toc224635323"/>
+      <w:bookmarkStart w:id="21" w:name="_Toc224635323"/>
       <w:r>
         <w:t>擴充性與可伸縮性（</w:t>
       </w:r>
@@ -26044,7 +26287,7 @@
       <w:r>
         <w:t>）</w:t>
       </w:r>
-      <w:bookmarkEnd w:id="25"/>
+      <w:bookmarkEnd w:id="21"/>
     </w:p>
     <w:p>
       <w:pPr>
@@ -26179,7 +26422,7 @@
         <w:pStyle w:val="2"/>
         <w:spacing w:before="180" w:after="180"/>
       </w:pPr>
-      <w:bookmarkStart w:id="26" w:name="_Toc224635324"/>
+      <w:bookmarkStart w:id="22" w:name="_Toc224635324"/>
       <w:r>
         <w:t>安全性需求（</w:t>
       </w:r>
@@ -26189,7 +26432,7 @@
       <w:r>
         <w:t>）</w:t>
       </w:r>
-      <w:bookmarkEnd w:id="26"/>
+      <w:bookmarkEnd w:id="22"/>
     </w:p>
     <w:p>
       <w:pPr>
@@ -27071,7 +27314,7 @@
         <w:pStyle w:val="2"/>
         <w:spacing w:before="180" w:after="180"/>
       </w:pPr>
-      <w:bookmarkStart w:id="27" w:name="_Toc224635325"/>
+      <w:bookmarkStart w:id="23" w:name="_Toc224635325"/>
       <w:r>
         <w:t>隱私與資料治理（</w:t>
       </w:r>
@@ -27081,7 +27324,7 @@
       <w:r>
         <w:t>）</w:t>
       </w:r>
-      <w:bookmarkEnd w:id="27"/>
+      <w:bookmarkEnd w:id="23"/>
     </w:p>
     <w:p>
       <w:pPr>
@@ -27446,7 +27689,7 @@
         <w:pStyle w:val="2"/>
         <w:spacing w:before="180" w:after="180"/>
       </w:pPr>
-      <w:bookmarkStart w:id="28" w:name="_Toc224635326"/>
+      <w:bookmarkStart w:id="24" w:name="_Toc224635326"/>
       <w:r>
         <w:t>AI</w:t>
       </w:r>
@@ -27459,7 +27702,7 @@
       <w:r>
         <w:t>）</w:t>
       </w:r>
-      <w:bookmarkEnd w:id="28"/>
+      <w:bookmarkEnd w:id="24"/>
     </w:p>
     <w:p>
       <w:pPr>
@@ -27580,7 +27823,7 @@
         <w:pStyle w:val="2"/>
         <w:spacing w:before="180" w:after="180"/>
       </w:pPr>
-      <w:bookmarkStart w:id="29" w:name="_Toc224635327"/>
+      <w:bookmarkStart w:id="25" w:name="_Toc224635327"/>
       <w:r>
         <w:t>可觀測性與監控（</w:t>
       </w:r>
@@ -27590,7 +27833,7 @@
       <w:r>
         <w:t>）</w:t>
       </w:r>
-      <w:bookmarkEnd w:id="29"/>
+      <w:bookmarkEnd w:id="25"/>
     </w:p>
     <w:p>
       <w:pPr>
@@ -27739,7 +27982,7 @@
         <w:pStyle w:val="2"/>
         <w:spacing w:before="180" w:after="180"/>
       </w:pPr>
-      <w:bookmarkStart w:id="30" w:name="_Toc224635328"/>
+      <w:bookmarkStart w:id="26" w:name="_Toc224635328"/>
       <w:r>
         <w:t>可維運性與版本管理（</w:t>
       </w:r>
@@ -27749,7 +27992,7 @@
       <w:r>
         <w:t>）</w:t>
       </w:r>
-      <w:bookmarkEnd w:id="30"/>
+      <w:bookmarkEnd w:id="26"/>
     </w:p>
     <w:p>
       <w:pPr>
@@ -28360,7 +28603,7 @@
         <w:pStyle w:val="2"/>
         <w:spacing w:before="180" w:after="180"/>
       </w:pPr>
-      <w:bookmarkStart w:id="31" w:name="_Toc224635329"/>
+      <w:bookmarkStart w:id="27" w:name="_Toc224635329"/>
       <w:r>
         <w:t>法規與標準遵循（</w:t>
       </w:r>
@@ -28370,7 +28613,7 @@
       <w:r>
         <w:t>）</w:t>
       </w:r>
-      <w:bookmarkEnd w:id="31"/>
+      <w:bookmarkEnd w:id="27"/>
     </w:p>
     <w:p>
       <w:pPr>
@@ -28468,11 +28711,11 @@
           <w:numId w:val="7"/>
         </w:numPr>
       </w:pPr>
-      <w:bookmarkStart w:id="32" w:name="_Toc224635330"/>
+      <w:bookmarkStart w:id="28" w:name="_Toc224635330"/>
       <w:r>
         <w:t>後端整合與資料模組</w:t>
       </w:r>
-      <w:bookmarkEnd w:id="32"/>
+      <w:bookmarkEnd w:id="28"/>
     </w:p>
     <w:p>
       <w:pPr>
@@ -28483,7 +28726,7 @@
         </w:numPr>
         <w:spacing w:before="180" w:after="180"/>
       </w:pPr>
-      <w:bookmarkStart w:id="33" w:name="_Toc224635331"/>
+      <w:bookmarkStart w:id="29" w:name="_Toc224635331"/>
       <w:r>
         <w:t xml:space="preserve">CRM / ERP / </w:t>
       </w:r>
@@ -28496,7 +28739,7 @@
       <w:r>
         <w:t>）</w:t>
       </w:r>
-      <w:bookmarkEnd w:id="33"/>
+      <w:bookmarkEnd w:id="29"/>
     </w:p>
     <w:p>
       <w:pPr>
@@ -28557,7 +28800,7 @@
         </w:numPr>
         <w:spacing w:before="180" w:after="180"/>
       </w:pPr>
-      <w:bookmarkStart w:id="34" w:name="_Toc224635332"/>
+      <w:bookmarkStart w:id="30" w:name="_Toc224635332"/>
       <w:r>
         <w:t>資料分析模組（</w:t>
       </w:r>
@@ -28567,7 +28810,7 @@
       <w:r>
         <w:t>）</w:t>
       </w:r>
-      <w:bookmarkEnd w:id="34"/>
+      <w:bookmarkEnd w:id="30"/>
     </w:p>
     <w:p>
       <w:pPr>
@@ -28610,7 +28853,7 @@
         </w:numPr>
         <w:spacing w:before="180" w:after="180"/>
       </w:pPr>
-      <w:bookmarkStart w:id="35" w:name="_Toc224635333"/>
+      <w:bookmarkStart w:id="31" w:name="_Toc224635333"/>
       <w:r>
         <w:t>搜尋引擎</w:t>
       </w:r>
@@ -28626,7 +28869,7 @@
       <w:r>
         <w:t>）</w:t>
       </w:r>
-      <w:bookmarkEnd w:id="35"/>
+      <w:bookmarkEnd w:id="31"/>
     </w:p>
     <w:p>
       <w:pPr>
@@ -28694,14 +28937,14 @@
           <w:numId w:val="7"/>
         </w:numPr>
       </w:pPr>
-      <w:bookmarkStart w:id="36" w:name="_Toc224635334"/>
+      <w:bookmarkStart w:id="32" w:name="_Toc224635334"/>
       <w:r>
         <w:t>AI</w:t>
       </w:r>
       <w:r>
         <w:t>增強服務模組</w:t>
       </w:r>
-      <w:bookmarkEnd w:id="36"/>
+      <w:bookmarkEnd w:id="32"/>
     </w:p>
     <w:p>
       <w:pPr>
@@ -28799,7 +29042,7 @@
         </w:numPr>
         <w:spacing w:before="180" w:after="180"/>
       </w:pPr>
-      <w:bookmarkStart w:id="37" w:name="_Toc224635335"/>
+      <w:bookmarkStart w:id="33" w:name="_Toc224635335"/>
       <w:r>
         <w:t>語音轉文字（</w:t>
       </w:r>
@@ -28809,7 +29052,7 @@
       <w:r>
         <w:t>）</w:t>
       </w:r>
-      <w:bookmarkEnd w:id="37"/>
+      <w:bookmarkEnd w:id="33"/>
     </w:p>
     <w:p>
       <w:pPr>
@@ -28856,7 +29099,7 @@
         </w:numPr>
         <w:spacing w:before="180" w:after="180"/>
       </w:pPr>
-      <w:bookmarkStart w:id="38" w:name="_Toc224635336"/>
+      <w:bookmarkStart w:id="34" w:name="_Toc224635336"/>
       <w:r>
         <w:t>AI</w:t>
       </w:r>
@@ -28869,7 +29112,7 @@
       <w:r>
         <w:t>）</w:t>
       </w:r>
-      <w:bookmarkEnd w:id="38"/>
+      <w:bookmarkEnd w:id="34"/>
     </w:p>
     <w:p>
       <w:pPr>
@@ -28929,7 +29172,7 @@
         </w:numPr>
         <w:spacing w:before="180" w:after="180"/>
       </w:pPr>
-      <w:bookmarkStart w:id="39" w:name="_Toc224635337"/>
+      <w:bookmarkStart w:id="35" w:name="_Toc224635337"/>
       <w:r>
         <w:t xml:space="preserve">Prompt </w:t>
       </w:r>
@@ -28948,7 +29191,7 @@
       <w:r>
         <w:t>）</w:t>
       </w:r>
-      <w:bookmarkEnd w:id="39"/>
+      <w:bookmarkEnd w:id="35"/>
     </w:p>
     <w:p>
       <w:pPr>
@@ -29015,7 +29258,7 @@
         </w:numPr>
         <w:spacing w:before="180" w:after="180"/>
       </w:pPr>
-      <w:bookmarkStart w:id="40" w:name="_Toc224635338"/>
+      <w:bookmarkStart w:id="36" w:name="_Toc224635338"/>
       <w:r>
         <w:t>AI</w:t>
       </w:r>
@@ -29028,7 +29271,7 @@
       <w:r>
         <w:t>）</w:t>
       </w:r>
-      <w:bookmarkEnd w:id="40"/>
+      <w:bookmarkEnd w:id="36"/>
     </w:p>
     <w:p>
       <w:pPr>
@@ -29089,7 +29332,7 @@
         </w:numPr>
         <w:spacing w:before="180" w:after="180"/>
       </w:pPr>
-      <w:bookmarkStart w:id="41" w:name="_Toc224635339"/>
+      <w:bookmarkStart w:id="37" w:name="_Toc224635339"/>
       <w:r>
         <w:t xml:space="preserve">AI </w:t>
       </w:r>
@@ -29102,7 +29345,7 @@
       <w:r>
         <w:t>）</w:t>
       </w:r>
-      <w:bookmarkEnd w:id="41"/>
+      <w:bookmarkEnd w:id="37"/>
     </w:p>
     <w:p>
       <w:pPr>
@@ -29145,7 +29388,7 @@
         </w:numPr>
         <w:spacing w:before="180" w:after="180"/>
       </w:pPr>
-      <w:bookmarkStart w:id="42" w:name="_Toc224635340"/>
+      <w:bookmarkStart w:id="38" w:name="_Toc224635340"/>
       <w:r>
         <w:lastRenderedPageBreak/>
         <w:t>回覆信心指標與可靠度評估（</w:t>
@@ -29156,7 +29399,7 @@
       <w:r>
         <w:t>）</w:t>
       </w:r>
-      <w:bookmarkEnd w:id="42"/>
+      <w:bookmarkEnd w:id="38"/>
     </w:p>
     <w:p>
       <w:pPr>
@@ -29199,11 +29442,11 @@
           <w:numId w:val="7"/>
         </w:numPr>
       </w:pPr>
-      <w:bookmarkStart w:id="43" w:name="_Toc224635341"/>
+      <w:bookmarkStart w:id="39" w:name="_Toc224635341"/>
       <w:r>
         <w:t>驗收標準</w:t>
       </w:r>
-      <w:bookmarkEnd w:id="43"/>
+      <w:bookmarkEnd w:id="39"/>
     </w:p>
     <w:p>
       <w:pPr>
@@ -29299,7 +29542,7 @@
         </w:numPr>
         <w:spacing w:before="180" w:after="180"/>
       </w:pPr>
-      <w:bookmarkStart w:id="44" w:name="_Toc224635342"/>
+      <w:bookmarkStart w:id="40" w:name="_Toc224635342"/>
       <w:r>
         <w:t>通用驗收條件（</w:t>
       </w:r>
@@ -29309,7 +29552,7 @@
       <w:r>
         <w:t>）</w:t>
       </w:r>
-      <w:bookmarkEnd w:id="44"/>
+      <w:bookmarkEnd w:id="40"/>
     </w:p>
     <w:p>
       <w:pPr>
@@ -29431,14 +29674,14 @@
         </w:numPr>
         <w:spacing w:before="180" w:after="180"/>
       </w:pPr>
-      <w:bookmarkStart w:id="45" w:name="_Toc224635343"/>
+      <w:bookmarkStart w:id="41" w:name="_Toc224635343"/>
       <w:r>
         <w:t xml:space="preserve">Navbar </w:t>
       </w:r>
       <w:r>
         <w:t>驗收條件</w:t>
       </w:r>
-      <w:bookmarkEnd w:id="45"/>
+      <w:bookmarkEnd w:id="41"/>
     </w:p>
     <w:p>
       <w:pPr>
@@ -29575,11 +29818,11 @@
         </w:numPr>
         <w:spacing w:before="180" w:after="180"/>
       </w:pPr>
-      <w:bookmarkStart w:id="46" w:name="_Toc224635344"/>
+      <w:bookmarkStart w:id="42" w:name="_Toc224635344"/>
       <w:r>
         <w:t>互動區驗收條件</w:t>
       </w:r>
-      <w:bookmarkEnd w:id="46"/>
+      <w:bookmarkEnd w:id="42"/>
     </w:p>
     <w:p>
       <w:pPr>
@@ -29654,11 +29897,11 @@
         </w:numPr>
         <w:spacing w:before="180" w:after="180"/>
       </w:pPr>
-      <w:bookmarkStart w:id="47" w:name="_Toc224635345"/>
+      <w:bookmarkStart w:id="43" w:name="_Toc224635345"/>
       <w:r>
         <w:t>輸入區驗收條件</w:t>
       </w:r>
-      <w:bookmarkEnd w:id="47"/>
+      <w:bookmarkEnd w:id="43"/>
     </w:p>
     <w:p>
       <w:pPr>
@@ -29780,11 +30023,11 @@
         </w:numPr>
         <w:spacing w:before="180" w:after="180"/>
       </w:pPr>
-      <w:bookmarkStart w:id="48" w:name="_Toc224635346"/>
+      <w:bookmarkStart w:id="44" w:name="_Toc224635346"/>
       <w:r>
         <w:t>側邊欄驗收條件</w:t>
       </w:r>
-      <w:bookmarkEnd w:id="48"/>
+      <w:bookmarkEnd w:id="44"/>
     </w:p>
     <w:p>
       <w:pPr>
@@ -29892,11 +30135,11 @@
         </w:numPr>
         <w:spacing w:before="180" w:after="180"/>
       </w:pPr>
-      <w:bookmarkStart w:id="49" w:name="_Toc224635347"/>
+      <w:bookmarkStart w:id="45" w:name="_Toc224635347"/>
       <w:r>
         <w:t>使用模式驗收條件</w:t>
       </w:r>
-      <w:bookmarkEnd w:id="49"/>
+      <w:bookmarkEnd w:id="45"/>
     </w:p>
     <w:p>
       <w:pPr>
@@ -30043,7 +30286,7 @@
         </w:numPr>
         <w:spacing w:before="180" w:after="180"/>
       </w:pPr>
-      <w:bookmarkStart w:id="50" w:name="_Toc224635348"/>
+      <w:bookmarkStart w:id="46" w:name="_Toc224635348"/>
       <w:r>
         <w:t xml:space="preserve">User Flow </w:t>
       </w:r>
@@ -30056,7 +30299,7 @@
       <w:r>
         <w:t>）</w:t>
       </w:r>
-      <w:bookmarkEnd w:id="50"/>
+      <w:bookmarkEnd w:id="46"/>
     </w:p>
     <w:p>
       <w:pPr>
@@ -30198,7 +30441,7 @@
         </w:numPr>
         <w:spacing w:before="180" w:after="180"/>
       </w:pPr>
-      <w:bookmarkStart w:id="51" w:name="_Toc224635349"/>
+      <w:bookmarkStart w:id="47" w:name="_Toc224635349"/>
       <w:r>
         <w:t>系統整體可靠性驗收條件（</w:t>
       </w:r>
@@ -30208,7 +30451,7 @@
       <w:r>
         <w:t>）</w:t>
       </w:r>
-      <w:bookmarkEnd w:id="51"/>
+      <w:bookmarkEnd w:id="47"/>
     </w:p>
     <w:p>
       <w:pPr>
@@ -30336,7 +30579,7 @@
         </w:numPr>
         <w:spacing w:before="180" w:after="180"/>
       </w:pPr>
-      <w:bookmarkStart w:id="52" w:name="_Toc224635350"/>
+      <w:bookmarkStart w:id="48" w:name="_Toc224635350"/>
       <w:r>
         <w:t>性能與穩定性驗收條件（</w:t>
       </w:r>
@@ -30346,7 +30589,7 @@
       <w:r>
         <w:t>）</w:t>
       </w:r>
-      <w:bookmarkEnd w:id="52"/>
+      <w:bookmarkEnd w:id="48"/>
     </w:p>
     <w:p>
       <w:pPr>
@@ -30548,7 +30791,7 @@
         </w:numPr>
         <w:spacing w:before="180" w:after="180"/>
       </w:pPr>
-      <w:bookmarkStart w:id="53" w:name="_Toc224635351"/>
+      <w:bookmarkStart w:id="49" w:name="_Toc224635351"/>
       <w:r>
         <w:t>安全性驗收條件（</w:t>
       </w:r>
@@ -30558,7 +30801,7 @@
       <w:r>
         <w:t>）</w:t>
       </w:r>
-      <w:bookmarkEnd w:id="53"/>
+      <w:bookmarkEnd w:id="49"/>
     </w:p>
     <w:p>
       <w:pPr>
@@ -30856,7 +31099,7 @@
         <w:pStyle w:val="2"/>
         <w:spacing w:before="180" w:after="180"/>
       </w:pPr>
-      <w:bookmarkStart w:id="54" w:name="_Toc224635352"/>
+      <w:bookmarkStart w:id="50" w:name="_Toc224635352"/>
       <w:r>
         <w:t>人員角色與安全治理之驗收條件（</w:t>
       </w:r>
@@ -30866,7 +31109,7 @@
       <w:r>
         <w:t>）</w:t>
       </w:r>
-      <w:bookmarkEnd w:id="54"/>
+      <w:bookmarkEnd w:id="50"/>
     </w:p>
     <w:p>
       <w:pPr>
@@ -32026,7 +32269,7 @@
         </w:numPr>
         <w:spacing w:before="180" w:after="180"/>
       </w:pPr>
-      <w:bookmarkStart w:id="55" w:name="_Toc224635353"/>
+      <w:bookmarkStart w:id="51" w:name="_Toc224635353"/>
       <w:r>
         <w:t>非功能性需求對應之驗收標準（</w:t>
       </w:r>
@@ -32036,7 +32279,7 @@
       <w:r>
         <w:t>）</w:t>
       </w:r>
-      <w:bookmarkEnd w:id="55"/>
+      <w:bookmarkEnd w:id="51"/>
     </w:p>
     <w:tbl>
       <w:tblPr>
@@ -32539,7 +32782,7 @@
         </w:numPr>
         <w:spacing w:before="180" w:after="180"/>
       </w:pPr>
-      <w:bookmarkStart w:id="56" w:name="_Toc224635354"/>
+      <w:bookmarkStart w:id="52" w:name="_Toc224635354"/>
       <w:r>
         <w:t>可維運性與版本管理驗收標準（</w:t>
       </w:r>
@@ -32549,7 +32792,7 @@
       <w:r>
         <w:t>）</w:t>
       </w:r>
-      <w:bookmarkEnd w:id="56"/>
+      <w:bookmarkEnd w:id="52"/>
     </w:p>
     <w:tbl>
       <w:tblPr>
@@ -33226,7 +33469,7 @@
         </w:numPr>
         <w:spacing w:before="180" w:after="180"/>
       </w:pPr>
-      <w:bookmarkStart w:id="57" w:name="_Toc224635355"/>
+      <w:bookmarkStart w:id="53" w:name="_Toc224635355"/>
       <w:r>
         <w:t>驗收角色說明（</w:t>
       </w:r>
@@ -33236,7 +33479,7 @@
       <w:r>
         <w:t>）</w:t>
       </w:r>
-      <w:bookmarkEnd w:id="57"/>
+      <w:bookmarkEnd w:id="53"/>
     </w:p>
     <w:tbl>
       <w:tblPr>
@@ -33441,14 +33684,14 @@
           <w:numId w:val="7"/>
         </w:numPr>
       </w:pPr>
-      <w:bookmarkStart w:id="58" w:name="_Toc224635356"/>
+      <w:bookmarkStart w:id="54" w:name="_Toc224635356"/>
       <w:r>
         <w:t>需求追蹤矩陣</w:t>
       </w:r>
       <w:r>
         <w:t xml:space="preserve"> (Requirement Traceability Matrix, RTM)</w:t>
       </w:r>
-      <w:bookmarkEnd w:id="58"/>
+      <w:bookmarkEnd w:id="54"/>
     </w:p>
     <w:p>
       <w:pPr>
@@ -33590,16 +33833,16 @@
         </w:numPr>
         <w:spacing w:before="180" w:after="180"/>
       </w:pPr>
-      <w:bookmarkStart w:id="59" w:name="_Toc217046129"/>
-      <w:bookmarkStart w:id="60" w:name="_Toc224635357"/>
+      <w:bookmarkStart w:id="55" w:name="_Toc217046129"/>
+      <w:bookmarkStart w:id="56" w:name="_Toc224635357"/>
       <w:r>
         <w:t>RTM</w:t>
       </w:r>
       <w:r>
         <w:t>建立原則與對齊方式</w:t>
       </w:r>
-      <w:bookmarkEnd w:id="59"/>
-      <w:bookmarkEnd w:id="60"/>
+      <w:bookmarkEnd w:id="55"/>
+      <w:bookmarkEnd w:id="56"/>
     </w:p>
     <w:p>
       <w:pPr>
@@ -34028,7 +34271,7 @@
         </w:numPr>
         <w:spacing w:before="180" w:after="180"/>
       </w:pPr>
-      <w:bookmarkStart w:id="61" w:name="_Toc224635358"/>
+      <w:bookmarkStart w:id="57" w:name="_Toc224635358"/>
       <w:r>
         <w:t>需求追蹤矩陣（</w:t>
       </w:r>
@@ -34038,7 +34281,7 @@
       <w:r>
         <w:t>）</w:t>
       </w:r>
-      <w:bookmarkEnd w:id="61"/>
+      <w:bookmarkEnd w:id="57"/>
     </w:p>
     <w:p>
       <w:pPr>
@@ -38657,14 +38900,14 @@
         </w:numPr>
         <w:spacing w:before="180" w:after="180"/>
       </w:pPr>
-      <w:bookmarkStart w:id="62" w:name="_Toc224635359"/>
+      <w:bookmarkStart w:id="58" w:name="_Toc224635359"/>
       <w:r>
         <w:t>RTM</w:t>
       </w:r>
       <w:r>
         <w:t>使用與維護說明</w:t>
       </w:r>
-      <w:bookmarkEnd w:id="62"/>
+      <w:bookmarkEnd w:id="58"/>
     </w:p>
     <w:p>
       <w:pPr>
@@ -38880,14 +39123,14 @@
           <w:numId w:val="7"/>
         </w:numPr>
       </w:pPr>
-      <w:bookmarkStart w:id="63" w:name="_Toc224635360"/>
+      <w:bookmarkStart w:id="59" w:name="_Toc224635360"/>
       <w:r>
         <w:t>系統完整度與邊界定義</w:t>
       </w:r>
       <w:r>
         <w:t xml:space="preserve"> (Interface &amp; Boundary Integrity)</w:t>
       </w:r>
-      <w:bookmarkEnd w:id="63"/>
+      <w:bookmarkEnd w:id="59"/>
     </w:p>
     <w:p>
       <w:pPr>
@@ -38951,7 +39194,7 @@
         </w:numPr>
         <w:spacing w:before="180" w:after="180"/>
       </w:pPr>
-      <w:bookmarkStart w:id="64" w:name="_Toc224635361"/>
+      <w:bookmarkStart w:id="60" w:name="_Toc224635361"/>
       <w:r>
         <w:t>系統責任完整度定義（</w:t>
       </w:r>
@@ -38961,7 +39204,7 @@
       <w:r>
         <w:t>）</w:t>
       </w:r>
-      <w:bookmarkEnd w:id="64"/>
+      <w:bookmarkEnd w:id="60"/>
     </w:p>
     <w:p>
       <w:pPr>
@@ -39276,7 +39519,7 @@
         </w:numPr>
         <w:spacing w:before="180" w:after="180"/>
       </w:pPr>
-      <w:bookmarkStart w:id="65" w:name="_Toc224635362"/>
+      <w:bookmarkStart w:id="61" w:name="_Toc224635362"/>
       <w:r>
         <w:t>AI</w:t>
       </w:r>
@@ -39289,7 +39532,7 @@
       <w:r>
         <w:t>）</w:t>
       </w:r>
-      <w:bookmarkEnd w:id="65"/>
+      <w:bookmarkEnd w:id="61"/>
     </w:p>
     <w:p>
       <w:pPr>
@@ -39675,7 +39918,7 @@
         </w:numPr>
         <w:spacing w:before="180" w:after="180"/>
       </w:pPr>
-      <w:bookmarkStart w:id="66" w:name="_Toc224635363"/>
+      <w:bookmarkStart w:id="62" w:name="_Toc224635363"/>
       <w:r>
         <w:t>跨系統整合之介面與責任切割（</w:t>
       </w:r>
@@ -39685,7 +39928,7 @@
       <w:r>
         <w:t>）</w:t>
       </w:r>
-      <w:bookmarkEnd w:id="66"/>
+      <w:bookmarkEnd w:id="62"/>
     </w:p>
     <w:p>
       <w:pPr>
@@ -40049,11 +40292,11 @@
         </w:numPr>
         <w:spacing w:before="180" w:after="180"/>
       </w:pPr>
-      <w:bookmarkStart w:id="67" w:name="_Toc224635364"/>
+      <w:bookmarkStart w:id="63" w:name="_Toc224635364"/>
       <w:r>
         <w:t>權限、資料治理與人為責任切割</w:t>
       </w:r>
-      <w:bookmarkEnd w:id="67"/>
+      <w:bookmarkEnd w:id="63"/>
     </w:p>
     <w:p>
       <w:pPr>
@@ -41568,11 +41811,11 @@
           <w:numId w:val="7"/>
         </w:numPr>
       </w:pPr>
-      <w:bookmarkStart w:id="68" w:name="_Toc224635365"/>
+      <w:bookmarkStart w:id="64" w:name="_Toc224635365"/>
       <w:r>
         <w:t>治理、安全與合規模組</w:t>
       </w:r>
-      <w:bookmarkEnd w:id="68"/>
+      <w:bookmarkEnd w:id="64"/>
     </w:p>
     <w:p>
       <w:pPr>
@@ -41583,7 +41826,7 @@
         </w:numPr>
         <w:spacing w:before="180" w:after="180"/>
       </w:pPr>
-      <w:bookmarkStart w:id="69" w:name="_Toc224635366"/>
+      <w:bookmarkStart w:id="65" w:name="_Toc224635366"/>
       <w:r>
         <w:t>存取控制與身分驗證（</w:t>
       </w:r>
@@ -41593,7 +41836,7 @@
       <w:r>
         <w:t>）</w:t>
       </w:r>
-      <w:bookmarkEnd w:id="69"/>
+      <w:bookmarkEnd w:id="65"/>
     </w:p>
     <w:p>
       <w:pPr>
@@ -41697,7 +41940,7 @@
         </w:numPr>
         <w:spacing w:before="180" w:after="180"/>
       </w:pPr>
-      <w:bookmarkStart w:id="70" w:name="_Toc224635367"/>
+      <w:bookmarkStart w:id="66" w:name="_Toc224635367"/>
       <w:r>
         <w:t>資料保護模組（</w:t>
       </w:r>
@@ -41707,7 +41950,7 @@
       <w:r>
         <w:t>）</w:t>
       </w:r>
-      <w:bookmarkEnd w:id="70"/>
+      <w:bookmarkEnd w:id="66"/>
     </w:p>
     <w:p>
       <w:pPr>
@@ -41784,7 +42027,7 @@
         </w:numPr>
         <w:spacing w:before="180" w:after="180"/>
       </w:pPr>
-      <w:bookmarkStart w:id="71" w:name="_Toc224635368"/>
+      <w:bookmarkStart w:id="67" w:name="_Toc224635368"/>
       <w:r>
         <w:t>隱私保護與</w:t>
       </w:r>
@@ -41800,7 +42043,7 @@
       <w:r>
         <w:t>）</w:t>
       </w:r>
-      <w:bookmarkEnd w:id="71"/>
+      <w:bookmarkEnd w:id="67"/>
     </w:p>
     <w:p>
       <w:pPr>
@@ -41911,7 +42154,7 @@
         </w:numPr>
         <w:spacing w:before="180" w:after="180"/>
       </w:pPr>
-      <w:bookmarkStart w:id="72" w:name="_Toc224635369"/>
+      <w:bookmarkStart w:id="68" w:name="_Toc224635369"/>
       <w:r>
         <w:t>稽核與報告（</w:t>
       </w:r>
@@ -41921,7 +42164,7 @@
       <w:r>
         <w:t>）</w:t>
       </w:r>
-      <w:bookmarkEnd w:id="72"/>
+      <w:bookmarkEnd w:id="68"/>
     </w:p>
     <w:p>
       <w:pPr>
@@ -42004,11 +42247,11 @@
         </w:numPr>
         <w:spacing w:before="180" w:after="180"/>
       </w:pPr>
-      <w:bookmarkStart w:id="73" w:name="_Toc224635370"/>
+      <w:bookmarkStart w:id="69" w:name="_Toc224635370"/>
       <w:r>
         <w:t>管理介面與運營工具</w:t>
       </w:r>
-      <w:bookmarkEnd w:id="73"/>
+      <w:bookmarkEnd w:id="69"/>
     </w:p>
     <w:p>
       <w:pPr>
@@ -42091,7 +42334,7 @@
         </w:numPr>
         <w:spacing w:before="180" w:after="180"/>
       </w:pPr>
-      <w:bookmarkStart w:id="74" w:name="_Toc224635371"/>
+      <w:bookmarkStart w:id="70" w:name="_Toc224635371"/>
       <w:r>
         <w:t>服務品質監控（</w:t>
       </w:r>
@@ -42101,7 +42344,7 @@
       <w:r>
         <w:t>）</w:t>
       </w:r>
-      <w:bookmarkEnd w:id="74"/>
+      <w:bookmarkEnd w:id="70"/>
     </w:p>
     <w:p>
       <w:pPr>
@@ -42176,7 +42419,7 @@
         </w:numPr>
         <w:spacing w:before="180" w:after="180"/>
       </w:pPr>
-      <w:bookmarkStart w:id="75" w:name="_Toc224635372"/>
+      <w:bookmarkStart w:id="71" w:name="_Toc224635372"/>
       <w:r>
         <w:t>版本管理與佈署（</w:t>
       </w:r>
@@ -42186,7 +42429,7 @@
       <w:r>
         <w:t>）</w:t>
       </w:r>
-      <w:bookmarkEnd w:id="75"/>
+      <w:bookmarkEnd w:id="71"/>
     </w:p>
     <w:p>
       <w:pPr>
@@ -53671,6 +53914,96 @@
   </w:num>
   <w:num w:numId="301" w16cid:durableId="945694733">
     <w:abstractNumId w:val="23"/>
+  </w:num>
+  <w:num w:numId="302" w16cid:durableId="1600524789">
+    <w:abstractNumId w:val="20"/>
+    <w:lvlOverride w:ilvl="0">
+      <w:startOverride w:val="1"/>
+    </w:lvlOverride>
+    <w:lvlOverride w:ilvl="1">
+      <w:startOverride w:val="1"/>
+    </w:lvlOverride>
+    <w:lvlOverride w:ilvl="2">
+      <w:startOverride w:val="1"/>
+    </w:lvlOverride>
+    <w:lvlOverride w:ilvl="3">
+      <w:startOverride w:val="1"/>
+    </w:lvlOverride>
+    <w:lvlOverride w:ilvl="4">
+      <w:startOverride w:val="1"/>
+    </w:lvlOverride>
+    <w:lvlOverride w:ilvl="5">
+      <w:startOverride w:val="1"/>
+    </w:lvlOverride>
+    <w:lvlOverride w:ilvl="6">
+      <w:startOverride w:val="1"/>
+    </w:lvlOverride>
+    <w:lvlOverride w:ilvl="7">
+      <w:startOverride w:val="1"/>
+    </w:lvlOverride>
+    <w:lvlOverride w:ilvl="8">
+      <w:startOverride w:val="1"/>
+    </w:lvlOverride>
+  </w:num>
+  <w:num w:numId="303" w16cid:durableId="472723063">
+    <w:abstractNumId w:val="20"/>
+    <w:lvlOverride w:ilvl="0">
+      <w:startOverride w:val="1"/>
+    </w:lvlOverride>
+    <w:lvlOverride w:ilvl="1">
+      <w:startOverride w:val="1"/>
+    </w:lvlOverride>
+    <w:lvlOverride w:ilvl="2">
+      <w:startOverride w:val="1"/>
+    </w:lvlOverride>
+    <w:lvlOverride w:ilvl="3">
+      <w:startOverride w:val="1"/>
+    </w:lvlOverride>
+    <w:lvlOverride w:ilvl="4">
+      <w:startOverride w:val="1"/>
+    </w:lvlOverride>
+    <w:lvlOverride w:ilvl="5">
+      <w:startOverride w:val="1"/>
+    </w:lvlOverride>
+    <w:lvlOverride w:ilvl="6">
+      <w:startOverride w:val="1"/>
+    </w:lvlOverride>
+    <w:lvlOverride w:ilvl="7">
+      <w:startOverride w:val="1"/>
+    </w:lvlOverride>
+    <w:lvlOverride w:ilvl="8">
+      <w:startOverride w:val="1"/>
+    </w:lvlOverride>
+  </w:num>
+  <w:num w:numId="304" w16cid:durableId="1909723583">
+    <w:abstractNumId w:val="20"/>
+    <w:lvlOverride w:ilvl="0">
+      <w:startOverride w:val="1"/>
+    </w:lvlOverride>
+    <w:lvlOverride w:ilvl="1">
+      <w:startOverride w:val="1"/>
+    </w:lvlOverride>
+    <w:lvlOverride w:ilvl="2">
+      <w:startOverride w:val="1"/>
+    </w:lvlOverride>
+    <w:lvlOverride w:ilvl="3">
+      <w:startOverride w:val="1"/>
+    </w:lvlOverride>
+    <w:lvlOverride w:ilvl="4">
+      <w:startOverride w:val="1"/>
+    </w:lvlOverride>
+    <w:lvlOverride w:ilvl="5">
+      <w:startOverride w:val="1"/>
+    </w:lvlOverride>
+    <w:lvlOverride w:ilvl="6">
+      <w:startOverride w:val="1"/>
+    </w:lvlOverride>
+    <w:lvlOverride w:ilvl="7">
+      <w:startOverride w:val="1"/>
+    </w:lvlOverride>
+    <w:lvlOverride w:ilvl="8">
+      <w:startOverride w:val="1"/>
+    </w:lvlOverride>
   </w:num>
   <w:numIdMacAtCleanup w:val="231"/>
 </w:numbering>

</xml_diff>